<commit_message>
se le cambio el nombre de aprendiz y documentos
</commit_message>
<xml_diff>
--- a/requisitos.docx
+++ b/requisitos.docx
@@ -115,7 +115,7 @@
         <w:rPr>
           <w:rFonts w:ascii="Arial" w:eastAsia="Arial" w:hAnsi="Arial" w:cs="Arial"/>
         </w:rPr>
-        <w:t>JONIER STIVEN GUTIERREZ SALCEDO - KEVIN MIGUEL ORTIZ TELLEZ</w:t>
+        <w:t>Leidy yohana quesada</w:t>
       </w:r>
     </w:p>
     <w:p>
@@ -125,6 +125,12 @@
           <w:rFonts w:ascii="Arial" w:eastAsia="Arial" w:hAnsi="Arial" w:cs="Arial"/>
         </w:rPr>
       </w:pPr>
+      <w:r>
+        <w:rPr>
+          <w:rFonts w:ascii="Arial" w:eastAsia="Arial" w:hAnsi="Arial" w:cs="Arial"/>
+        </w:rPr>
+        <w:t>DOCUMENTOS</w:t>
+      </w:r>
     </w:p>
     <w:p>
       <w:pPr>
@@ -137,8 +143,15 @@
         <w:rPr>
           <w:rFonts w:ascii="Arial" w:eastAsia="Arial" w:hAnsi="Arial" w:cs="Arial"/>
         </w:rPr>
-        <w:t>DOCUMENTOS</w:t>
-      </w:r>
+        <w:t>1004300750</w:t>
+      </w:r>
+    </w:p>
+    <w:p>
+      <w:pPr>
+        <w:rPr>
+          <w:rFonts w:ascii="Arial" w:eastAsia="Arial" w:hAnsi="Arial" w:cs="Arial"/>
+        </w:rPr>
+      </w:pPr>
     </w:p>
     <w:p>
       <w:pPr>
@@ -151,28 +164,8 @@
         <w:rPr>
           <w:rFonts w:ascii="Arial" w:eastAsia="Arial" w:hAnsi="Arial" w:cs="Arial"/>
         </w:rPr>
-        <w:t xml:space="preserve">1003966240- </w:t>
-      </w:r>
-      <w:r>
-        <w:rPr>
-          <w:rFonts w:ascii="Arial" w:eastAsia="Arial" w:hAnsi="Arial" w:cs="Arial"/>
-        </w:rPr>
-        <w:t>1077847716</w:t>
-      </w:r>
-    </w:p>
-    <w:p>
-      <w:pPr>
-        <w:rPr>
-          <w:rFonts w:ascii="Arial" w:eastAsia="Arial" w:hAnsi="Arial" w:cs="Arial"/>
-        </w:rPr>
-      </w:pPr>
-    </w:p>
-    <w:p>
-      <w:pPr>
-        <w:rPr>
-          <w:rFonts w:ascii="Arial" w:eastAsia="Arial" w:hAnsi="Arial" w:cs="Arial"/>
-        </w:rPr>
-      </w:pPr>
+        <w:t>INSTRUCTOR</w:t>
+      </w:r>
     </w:p>
     <w:p>
       <w:pPr>
@@ -185,7 +178,7 @@
         <w:rPr>
           <w:rFonts w:ascii="Arial" w:eastAsia="Arial" w:hAnsi="Arial" w:cs="Arial"/>
         </w:rPr>
-        <w:t>INSTRUCTOR</w:t>
+        <w:t>JULIAN ANDRES TRUJILLO MORALES</w:t>
       </w:r>
     </w:p>
     <w:p>
@@ -195,12 +188,6 @@
           <w:rFonts w:ascii="Arial" w:eastAsia="Arial" w:hAnsi="Arial" w:cs="Arial"/>
         </w:rPr>
       </w:pPr>
-      <w:r>
-        <w:rPr>
-          <w:rFonts w:ascii="Arial" w:eastAsia="Arial" w:hAnsi="Arial" w:cs="Arial"/>
-        </w:rPr>
-        <w:t>JULIAN ANDRES TRUJILLO MORALES</w:t>
-      </w:r>
     </w:p>
     <w:p>
       <w:pPr>
@@ -233,6 +220,12 @@
           <w:rFonts w:ascii="Arial" w:eastAsia="Arial" w:hAnsi="Arial" w:cs="Arial"/>
         </w:rPr>
       </w:pPr>
+      <w:r>
+        <w:rPr>
+          <w:rFonts w:ascii="Arial" w:eastAsia="Arial" w:hAnsi="Arial" w:cs="Arial"/>
+        </w:rPr>
+        <w:t>CENTRO AGROEMPRESARIAL Y PECUARIO DEL HUILA</w:t>
+      </w:r>
     </w:p>
     <w:p>
       <w:pPr>
@@ -245,7 +238,7 @@
         <w:rPr>
           <w:rFonts w:ascii="Arial" w:eastAsia="Arial" w:hAnsi="Arial" w:cs="Arial"/>
         </w:rPr>
-        <w:t>CENTRO AGROEMPRESARIAL Y PECUARIO DEL HUILA</w:t>
+        <w:t>10 DE OCTUBRE DE 2025, GARZON HUILA</w:t>
       </w:r>
     </w:p>
     <w:p>
@@ -259,7 +252,7 @@
         <w:rPr>
           <w:rFonts w:ascii="Arial" w:eastAsia="Arial" w:hAnsi="Arial" w:cs="Arial"/>
         </w:rPr>
-        <w:t>10 DE OCTUBRE DE 2025, GARZON HUILA</w:t>
+        <w:t>ADSO</w:t>
       </w:r>
     </w:p>
     <w:p>
@@ -273,7 +266,7 @@
         <w:rPr>
           <w:rFonts w:ascii="Arial" w:eastAsia="Arial" w:hAnsi="Arial" w:cs="Arial"/>
         </w:rPr>
-        <w:t>ADSO</w:t>
+        <w:t>FICHA: 3229944</w:t>
       </w:r>
     </w:p>
     <w:p>
@@ -287,21 +280,6 @@
         <w:rPr>
           <w:rFonts w:ascii="Arial" w:eastAsia="Arial" w:hAnsi="Arial" w:cs="Arial"/>
         </w:rPr>
-        <w:t>FICHA: 3229944</w:t>
-      </w:r>
-    </w:p>
-    <w:p>
-      <w:pPr>
-        <w:jc w:val="center"/>
-        <w:rPr>
-          <w:rFonts w:ascii="Arial" w:eastAsia="Arial" w:hAnsi="Arial" w:cs="Arial"/>
-        </w:rPr>
-      </w:pPr>
-      <w:r>
-        <w:rPr>
-          <w:rFonts w:ascii="Arial" w:eastAsia="Arial" w:hAnsi="Arial" w:cs="Arial"/>
-        </w:rPr>
-        <w:lastRenderedPageBreak/>
         <w:t>INTRODUCCION.</w:t>
       </w:r>
     </w:p>

</xml_diff>

<commit_message>
se le elimino dos cripterios de aceptacion
</commit_message>
<xml_diff>
--- a/requisitos.docx
+++ b/requisitos.docx
@@ -4676,50 +4676,11 @@
       </w:r>
     </w:p>
     <w:p>
-      <w:pPr>
-        <w:rPr>
-          <w:rFonts w:ascii="Arial" w:eastAsia="Arial" w:hAnsi="Arial" w:cs="Arial"/>
-        </w:rPr>
-      </w:pPr>
-      <w:r>
-        <w:rPr>
-          <w:rFonts w:ascii="Arial" w:eastAsia="Arial" w:hAnsi="Arial" w:cs="Arial"/>
-        </w:rPr>
-        <w:t xml:space="preserve">✓ </w:t>
-      </w:r>
-      <w:r>
-        <w:rPr>
-          <w:rFonts w:ascii="Arial" w:eastAsia="Arial" w:hAnsi="Arial" w:cs="Arial"/>
-        </w:rPr>
-        <w:t xml:space="preserve">El sistema asigna un repartidor disponible </w:t>
-      </w:r>
-      <w:r>
-        <w:rPr>
-          <w:rFonts w:ascii="Arial" w:eastAsia="Arial" w:hAnsi="Arial" w:cs="Arial"/>
-        </w:rPr>
-        <w:t xml:space="preserve">en el radio mas cercano </w:t>
-      </w:r>
-    </w:p>
-    <w:p>
-      <w:r>
-        <w:rPr>
-          <w:rFonts w:ascii="Arial" w:eastAsia="Arial" w:hAnsi="Arial" w:cs="Arial"/>
-        </w:rPr>
-        <w:t xml:space="preserve">✓ </w:t>
-      </w:r>
-      <w:r>
-        <w:rPr>
-          <w:rFonts w:ascii="Arial" w:eastAsia="Arial" w:hAnsi="Arial" w:cs="Arial"/>
-        </w:rPr>
-        <w:t>El sistema recibirá el pedido en menos de  5 segundos tras ser confirmado.</w:t>
-      </w:r>
-    </w:p>
-    <w:p>
-      <w:r>
-        <w:rPr>
-          <w:rFonts w:ascii="Arial" w:eastAsia="Arial" w:hAnsi="Arial" w:cs="Arial"/>
-        </w:rPr>
-        <w:t xml:space="preserve">✓ </w:t>
+      <w:r>
+        <w:rPr>
+          <w:rFonts w:ascii="Arial" w:eastAsia="Arial" w:hAnsi="Arial" w:cs="Arial"/>
+        </w:rPr>
+        <w:t xml:space="preserve"> </w:t>
       </w:r>
     </w:p>
     <w:sectPr>

</xml_diff>